<commit_message>
﻿feat: publicar S05 (Outlook+Teams) apos re-score 7.5/10 + verificacao legal
Melhorias do re-score (Tiago 5.5->7.5->~8): slogan MAPEIA-NAO-DECIDAS
reduzido de ~9 para ~3 enfaticas; Plano B do "espelho" para quando o
nao-determinismo nao coopera (pagina + resolucao); alivio de tempo
com guia "se derrapar corta o Caso #2" (worksheet + resolucao).

Ressalvas da verificacao adversarial (solido com ressalvas, 0 achados
fatais): AIPD "afigura-se exigivel, a confirmar pela CNPD" (nao
automatica); modelos Anthropic off por defeito na UE (EU Data
Boundary); timestamp = Recap/.vtt (o .docx exportado usa hora do dia).

Co-Authored-By: Claude Opus 4.8 (1M context) <noreply@anthropic.com>
</commit_message>
<xml_diff>
--- a/sessoes/sessao-05/Dataset_S05_Comunicacao.docx
+++ b/sessoes/sessao-05/Dataset_S05_Comunicacao.docx
@@ -1127,7 +1127,7 @@
         <w:t xml:space="preserve"> </w:t>
       </w:r>
       <w:r>
-        <w:t xml:space="preserve">é exigível ao abrigo do art. 35.º do RGPD, dado tratar-se de uso sistemático de IA com possibilidade de tratamento de dados pessoais (RGPD art. 35.º/3, al. a) e b)).</w:t>
+        <w:t xml:space="preserve">afigura-se exigível ao abrigo do art. 35.º do RGPD (em particular a al. a) do n.º 3), a confirmar face aos critérios e à lista da CNPD, dado tratar-se de uso sistemático de IA com possibilidade de tratamento de dados pessoais.</w:t>
       </w:r>
       <w:r>
         <w:t xml:space="preserve"> </w:t>
@@ -1175,7 +1175,23 @@
         <w:t xml:space="preserve">Registo da Anthropic como subprocessadora da Microsoft</w:t>
       </w:r>
       <w:r>
-        <w:t xml:space="preserve">, desde janeiro de 2026, obriga a atualização do nosso Registo de Atividades de Tratamento e do Acordo de Tratamento de Dados;</w:t>
+        <w:t xml:space="preserve">, desde janeiro de 2026, obriga a atualizar o nosso Registo de Atividades de Tratamento e o Acordo de Tratamento de Dados — ainda que, por defeito, estes modelos estejam</w:t>
+      </w:r>
+      <w:r>
+        <w:t xml:space="preserve"> </w:t>
+      </w:r>
+      <w:r>
+        <w:rPr>
+          <w:b/>
+          <w:bCs/>
+        </w:rPr>
+        <w:t xml:space="preserve">desativados na UE</w:t>
+      </w:r>
+      <w:r>
+        <w:t xml:space="preserve"> </w:t>
+      </w:r>
+      <w:r>
+        <w:t xml:space="preserve">(EU Data Boundary), pelo que a atualização só releva se a instituição optar por ativá-los;</w:t>
       </w:r>
     </w:p>
     <w:p>
@@ -2398,7 +2414,23 @@
         <w:t xml:space="preserve"> </w:t>
       </w:r>
       <w:r>
-        <w:t xml:space="preserve">tempo decorrido desde o início da reunião (como na transcrição real do Teams)</w:t>
+        <w:t xml:space="preserve">tempo decorrido desde o início da reunião — como aparece na linha temporal do</w:t>
+      </w:r>
+      <w:r>
+        <w:t xml:space="preserve"> </w:t>
+      </w:r>
+      <w:r>
+        <w:rPr>
+          <w:i/>
+          <w:iCs/>
+        </w:rPr>
+        <w:t xml:space="preserve">Recap</w:t>
+      </w:r>
+      <w:r>
+        <w:t xml:space="preserve"> </w:t>
+      </w:r>
+      <w:r>
+        <w:t xml:space="preserve">e no ficheiro de legendas (.vtt) do Teams (a transcrição exportada em Word usa hora do dia)</w:t>
       </w:r>
     </w:p>
     <w:p>

</xml_diff>